<commit_message>
=Added all the materils with sql code
</commit_message>
<xml_diff>
--- a/Employee Attrition Analysis Uncovering Why Talent Leaves.docx
+++ b/Employee Attrition Analysis Uncovering Why Talent Leaves.docx
@@ -65,51 +65,7 @@
           <w:cs/>
           <w:lang w:bidi="bn-BD"/>
         </w:rPr>
-        <w:t xml:space="preserve">কোন </w:t>
-      </w:r>
-      <w:proofErr w:type="spellStart"/>
-      <w:r>
-        <w:rPr>
-          <w:rFonts w:ascii="Kalpurush" w:hAnsi="Kalpurush" w:cs="Kalpurush"/>
-          <w:b/>
-          <w:bCs/>
-          <w:cs/>
-          <w:lang w:bidi="bn-BD"/>
-        </w:rPr>
-        <w:t>ফ্যাক্টরগুলো</w:t>
-      </w:r>
-      <w:proofErr w:type="spellEnd"/>
-      <w:r>
-        <w:rPr>
-          <w:rFonts w:ascii="Kalpurush" w:hAnsi="Kalpurush" w:cs="Kalpurush"/>
-          <w:b/>
-          <w:bCs/>
-          <w:cs/>
-          <w:lang w:bidi="bn-BD"/>
-        </w:rPr>
-        <w:t xml:space="preserve"> একজন কর্মচারীকে চাকরি </w:t>
-      </w:r>
-      <w:proofErr w:type="spellStart"/>
-      <w:r>
-        <w:rPr>
-          <w:rFonts w:ascii="Kalpurush" w:hAnsi="Kalpurush" w:cs="Kalpurush"/>
-          <w:b/>
-          <w:bCs/>
-          <w:cs/>
-          <w:lang w:bidi="bn-BD"/>
-        </w:rPr>
-        <w:t>ছাড়তে</w:t>
-      </w:r>
-      <w:proofErr w:type="spellEnd"/>
-      <w:r>
-        <w:rPr>
-          <w:rFonts w:ascii="Kalpurush" w:hAnsi="Kalpurush" w:cs="Kalpurush"/>
-          <w:b/>
-          <w:bCs/>
-          <w:cs/>
-          <w:lang w:bidi="bn-BD"/>
-        </w:rPr>
-        <w:t xml:space="preserve"> (</w:t>
+        <w:t>কোন ফ্যাক্টরগুলো একজন কর্মচারীকে চাকরি ছাড়তে (</w:t>
       </w:r>
       <w:r>
         <w:rPr>
@@ -179,61 +135,7 @@
           <w:cs/>
           <w:lang w:bidi="bn-BD"/>
         </w:rPr>
-        <w:t xml:space="preserve">অতিরিক্ত </w:t>
-      </w:r>
-      <w:proofErr w:type="spellStart"/>
-      <w:r>
-        <w:rPr>
-          <w:rFonts w:ascii="Kalpurush" w:hAnsi="Kalpurush" w:cs="Kalpurush"/>
-          <w:cs/>
-          <w:lang w:bidi="bn-BD"/>
-        </w:rPr>
-        <w:t>কর্মঘণ্টা</w:t>
-      </w:r>
-      <w:proofErr w:type="spellEnd"/>
-      <w:r>
-        <w:rPr>
-          <w:rFonts w:ascii="Kalpurush" w:hAnsi="Kalpurush" w:cs="Kalpurush"/>
-          <w:cs/>
-          <w:lang w:bidi="bn-BD"/>
-        </w:rPr>
-        <w:t xml:space="preserve"> বা </w:t>
-      </w:r>
-      <w:proofErr w:type="spellStart"/>
-      <w:r>
-        <w:rPr>
-          <w:rFonts w:ascii="Kalpurush" w:hAnsi="Kalpurush" w:cs="Kalpurush"/>
-          <w:cs/>
-          <w:lang w:bidi="bn-BD"/>
-        </w:rPr>
-        <w:t>ওভারটাইম</w:t>
-      </w:r>
-      <w:proofErr w:type="spellEnd"/>
-      <w:r>
-        <w:rPr>
-          <w:rFonts w:ascii="Kalpurush" w:hAnsi="Kalpurush" w:cs="Kalpurush"/>
-          <w:cs/>
-          <w:lang w:bidi="bn-BD"/>
-        </w:rPr>
-        <w:t xml:space="preserve"> কি তাদের </w:t>
-      </w:r>
-      <w:proofErr w:type="spellStart"/>
-      <w:r>
-        <w:rPr>
-          <w:rFonts w:ascii="Kalpurush" w:hAnsi="Kalpurush" w:cs="Kalpurush"/>
-          <w:cs/>
-          <w:lang w:bidi="bn-BD"/>
-        </w:rPr>
-        <w:t>অসন্তুষ্ট</w:t>
-      </w:r>
-      <w:proofErr w:type="spellEnd"/>
-      <w:r>
-        <w:rPr>
-          <w:rFonts w:ascii="Kalpurush" w:hAnsi="Kalpurush" w:cs="Kalpurush"/>
-          <w:cs/>
-          <w:lang w:bidi="bn-BD"/>
-        </w:rPr>
-        <w:t xml:space="preserve"> করছে</w:t>
+        <w:t>অতিরিক্ত কর্মঘণ্টা বা ওভারটাইম কি তাদের অসন্তুষ্ট করছে</w:t>
       </w:r>
       <w:r>
         <w:rPr>
@@ -258,102 +160,56 @@
           <w:cs/>
           <w:lang w:bidi="bn-BD"/>
         </w:rPr>
-        <w:t xml:space="preserve">তাদের </w:t>
-      </w:r>
-      <w:proofErr w:type="spellStart"/>
-      <w:r>
-        <w:rPr>
-          <w:rFonts w:ascii="Kalpurush" w:hAnsi="Kalpurush" w:cs="Kalpurush"/>
+        <w:t>তাদের প্রোমোশন বা ক্যারিয়ার বৃদ্ধির সুযোগ কি কম</w:t>
+      </w:r>
+      <w:r>
+        <w:rPr>
+          <w:rFonts w:ascii="Kalpurush" w:hAnsi="Kalpurush" w:cs="Kalpurush"/>
+        </w:rPr>
+        <w:t>?</w:t>
+      </w:r>
+    </w:p>
+    <w:p>
+      <w:pPr>
+        <w:rPr>
+          <w:rFonts w:ascii="Kalpurush" w:hAnsi="Kalpurush" w:cs="Kalpurush"/>
+          <w:b/>
+          <w:bCs/>
+        </w:rPr>
+      </w:pPr>
+      <w:r>
+        <w:rPr>
+          <w:rFonts w:ascii="Kalpurush" w:hAnsi="Kalpurush" w:cs="Kalpurush"/>
+          <w:b/>
+          <w:bCs/>
           <w:cs/>
           <w:lang w:bidi="bn-BD"/>
         </w:rPr>
-        <w:t>প্রোমোশন</w:t>
-      </w:r>
-      <w:proofErr w:type="spellEnd"/>
+        <w:t>২. কর্মচারীদের প্যাটার্ন বোঝা (</w:t>
+      </w:r>
+      <w:r>
+        <w:rPr>
+          <w:rFonts w:ascii="Kalpurush" w:hAnsi="Kalpurush" w:cs="Kalpurush"/>
+          <w:b/>
+          <w:bCs/>
+        </w:rPr>
+        <w:t>Identifying Patterns)</w:t>
+      </w:r>
+    </w:p>
+    <w:p>
+      <w:pPr>
+        <w:rPr>
+          <w:rFonts w:ascii="Kalpurush" w:hAnsi="Kalpurush" w:cs="Kalpurush"/>
+        </w:rPr>
+      </w:pPr>
       <w:r>
         <w:rPr>
           <w:rFonts w:ascii="Kalpurush" w:hAnsi="Kalpurush" w:cs="Kalpurush"/>
           <w:cs/>
           <w:lang w:bidi="bn-BD"/>
         </w:rPr>
-        <w:t xml:space="preserve"> বা </w:t>
-      </w:r>
-      <w:proofErr w:type="spellStart"/>
-      <w:r>
-        <w:rPr>
-          <w:rFonts w:ascii="Kalpurush" w:hAnsi="Kalpurush" w:cs="Kalpurush"/>
-          <w:cs/>
-          <w:lang w:bidi="bn-BD"/>
-        </w:rPr>
-        <w:t>ক্যারিয়ার</w:t>
-      </w:r>
-      <w:proofErr w:type="spellEnd"/>
-      <w:r>
-        <w:rPr>
-          <w:rFonts w:ascii="Kalpurush" w:hAnsi="Kalpurush" w:cs="Kalpurush"/>
-          <w:cs/>
-          <w:lang w:bidi="bn-BD"/>
-        </w:rPr>
-        <w:t xml:space="preserve"> বৃদ্ধির সুযোগ কি কম</w:t>
-      </w:r>
-      <w:r>
-        <w:rPr>
-          <w:rFonts w:ascii="Kalpurush" w:hAnsi="Kalpurush" w:cs="Kalpurush"/>
-        </w:rPr>
-        <w:t>?</w:t>
-      </w:r>
-    </w:p>
-    <w:p>
-      <w:pPr>
-        <w:rPr>
-          <w:rFonts w:ascii="Kalpurush" w:hAnsi="Kalpurush" w:cs="Kalpurush"/>
-          <w:b/>
-          <w:bCs/>
-        </w:rPr>
-      </w:pPr>
-      <w:r>
-        <w:rPr>
-          <w:rFonts w:ascii="Kalpurush" w:hAnsi="Kalpurush" w:cs="Kalpurush"/>
-          <w:b/>
-          <w:bCs/>
-          <w:cs/>
-          <w:lang w:bidi="bn-BD"/>
-        </w:rPr>
-        <w:t>২. কর্মচারীদের প্যাটার্ন বোঝা (</w:t>
-      </w:r>
-      <w:r>
-        <w:rPr>
-          <w:rFonts w:ascii="Kalpurush" w:hAnsi="Kalpurush" w:cs="Kalpurush"/>
-          <w:b/>
-          <w:bCs/>
-        </w:rPr>
-        <w:t>Identifying Patterns)</w:t>
-      </w:r>
-    </w:p>
-    <w:p>
-      <w:pPr>
-        <w:rPr>
-          <w:rFonts w:ascii="Kalpurush" w:hAnsi="Kalpurush" w:cs="Kalpurush"/>
-        </w:rPr>
-      </w:pPr>
-      <w:r>
-        <w:rPr>
-          <w:rFonts w:ascii="Kalpurush" w:hAnsi="Kalpurush" w:cs="Kalpurush"/>
-          <w:cs/>
-          <w:lang w:bidi="bn-BD"/>
-        </w:rPr>
-        <w:t xml:space="preserve">আমরা খুঁজে বের করার চেষ্টা করব নির্দিষ্ট কোনো গ্রুপ কি বেশি চাকরি </w:t>
-      </w:r>
-      <w:proofErr w:type="spellStart"/>
-      <w:r>
-        <w:rPr>
-          <w:rFonts w:ascii="Kalpurush" w:hAnsi="Kalpurush" w:cs="Kalpurush"/>
-          <w:cs/>
-          <w:lang w:bidi="bn-BD"/>
-        </w:rPr>
-        <w:t>ছাড়ছে</w:t>
-      </w:r>
-      <w:proofErr w:type="spellEnd"/>
+        <w:t>আমরা খুঁজে বের করার চেষ্টা করব নির্দিষ্ট কোনো গ্রুপ কি বেশি চাকরি ছাড়ছে</w:t>
+      </w:r>
       <w:r>
         <w:rPr>
           <w:rFonts w:ascii="Kalpurush" w:hAnsi="Kalpurush" w:cs="Kalpurush"/>
@@ -393,25 +249,7 @@
           <w:cs/>
           <w:lang w:bidi="bn-BD"/>
         </w:rPr>
-        <w:t xml:space="preserve">তরুণ কর্মীরা কি </w:t>
-      </w:r>
-      <w:proofErr w:type="spellStart"/>
-      <w:r>
-        <w:rPr>
-          <w:rFonts w:ascii="Kalpurush" w:hAnsi="Kalpurush" w:cs="Kalpurush"/>
-          <w:cs/>
-          <w:lang w:bidi="bn-BD"/>
-        </w:rPr>
-        <w:t>অভিজ্ঞদের</w:t>
-      </w:r>
-      <w:proofErr w:type="spellEnd"/>
-      <w:r>
-        <w:rPr>
-          <w:rFonts w:ascii="Kalpurush" w:hAnsi="Kalpurush" w:cs="Kalpurush"/>
-          <w:cs/>
-          <w:lang w:bidi="bn-BD"/>
-        </w:rPr>
-        <w:t xml:space="preserve"> চেয়ে বেশি চলে যাচ্ছেন</w:t>
+        <w:t>তরুণ কর্মীরা কি অভিজ্ঞদের চেয়ে বেশি চলে যাচ্ছেন</w:t>
       </w:r>
       <w:r>
         <w:rPr>
@@ -452,25 +290,7 @@
           <w:cs/>
           <w:lang w:bidi="bn-BD"/>
         </w:rPr>
-        <w:t xml:space="preserve">সেলস বা রিসার্চের মতো নির্দিষ্ট কোনো বিভাগে কি </w:t>
-      </w:r>
-      <w:proofErr w:type="spellStart"/>
-      <w:r>
-        <w:rPr>
-          <w:rFonts w:ascii="Kalpurush" w:hAnsi="Kalpurush" w:cs="Kalpurush"/>
-          <w:cs/>
-          <w:lang w:bidi="bn-BD"/>
-        </w:rPr>
-        <w:t>অ্যাট্রিশন</w:t>
-      </w:r>
-      <w:proofErr w:type="spellEnd"/>
-      <w:r>
-        <w:rPr>
-          <w:rFonts w:ascii="Kalpurush" w:hAnsi="Kalpurush" w:cs="Kalpurush"/>
-          <w:cs/>
-          <w:lang w:bidi="bn-BD"/>
-        </w:rPr>
-        <w:t xml:space="preserve"> রেট বেশি</w:t>
+        <w:t>সেলস বা রিসার্চের মতো নির্দিষ্ট কোনো বিভাগে কি অ্যাট্রিশন রেট বেশি</w:t>
       </w:r>
       <w:r>
         <w:rPr>
@@ -572,23 +392,13 @@
           <w:rFonts w:ascii="Kalpurush" w:hAnsi="Kalpurush" w:cs="Kalpurush"/>
         </w:rPr>
       </w:pPr>
-      <w:proofErr w:type="spellStart"/>
       <w:r>
         <w:rPr>
           <w:rFonts w:ascii="Kalpurush" w:hAnsi="Kalpurush" w:cs="Kalpurush"/>
           <w:cs/>
           <w:lang w:bidi="bn-BD"/>
         </w:rPr>
-        <w:t>অ্যাট্রিশনের</w:t>
-      </w:r>
-      <w:proofErr w:type="spellEnd"/>
-      <w:r>
-        <w:rPr>
-          <w:rFonts w:ascii="Kalpurush" w:hAnsi="Kalpurush" w:cs="Kalpurush"/>
-          <w:cs/>
-          <w:lang w:bidi="bn-BD"/>
-        </w:rPr>
-        <w:t xml:space="preserve"> ফলে কোম্পানির সম্ভাব্য আর্থিক ক্ষতি অনুমান করা</w:t>
+        <w:t>অ্যাট্রিশনের ফলে কোম্পানির সম্ভাব্য আর্থিক ক্ষতি অনুমান করা</w:t>
       </w:r>
       <w:r>
         <w:rPr>
@@ -659,65 +469,27 @@
           <w:rFonts w:ascii="Kalpurush" w:hAnsi="Kalpurush" w:cs="Kalpurush"/>
         </w:rPr>
       </w:pPr>
-      <w:proofErr w:type="spellStart"/>
       <w:r>
         <w:rPr>
           <w:rFonts w:ascii="Kalpurush" w:hAnsi="Kalpurush" w:cs="Kalpurush"/>
           <w:cs/>
           <w:lang w:bidi="bn-BD"/>
         </w:rPr>
-        <w:t>অ্যানালাইসিসের</w:t>
-      </w:r>
-      <w:proofErr w:type="spellEnd"/>
+        <w:t>অ্যানালাইসিসের শেষে আপনার লক্ষ্য থাকবে এইচআর (</w:t>
+      </w:r>
+      <w:r>
+        <w:rPr>
+          <w:rFonts w:ascii="Kalpurush" w:hAnsi="Kalpurush" w:cs="Kalpurush"/>
+        </w:rPr>
+        <w:t xml:space="preserve">HR) </w:t>
+      </w:r>
       <w:r>
         <w:rPr>
           <w:rFonts w:ascii="Kalpurush" w:hAnsi="Kalpurush" w:cs="Kalpurush"/>
           <w:cs/>
           <w:lang w:bidi="bn-BD"/>
         </w:rPr>
-        <w:t xml:space="preserve"> শেষে আপনার লক্ষ্য থাকবে </w:t>
-      </w:r>
-      <w:proofErr w:type="spellStart"/>
-      <w:r>
-        <w:rPr>
-          <w:rFonts w:ascii="Kalpurush" w:hAnsi="Kalpurush" w:cs="Kalpurush"/>
-          <w:cs/>
-          <w:lang w:bidi="bn-BD"/>
-        </w:rPr>
-        <w:t>এইচআর</w:t>
-      </w:r>
-      <w:proofErr w:type="spellEnd"/>
-      <w:r>
-        <w:rPr>
-          <w:rFonts w:ascii="Kalpurush" w:hAnsi="Kalpurush" w:cs="Kalpurush"/>
-          <w:cs/>
-          <w:lang w:bidi="bn-BD"/>
-        </w:rPr>
-        <w:t xml:space="preserve"> (</w:t>
-      </w:r>
-      <w:r>
-        <w:rPr>
-          <w:rFonts w:ascii="Kalpurush" w:hAnsi="Kalpurush" w:cs="Kalpurush"/>
-        </w:rPr>
-        <w:t xml:space="preserve">HR) </w:t>
-      </w:r>
-      <w:proofErr w:type="spellStart"/>
-      <w:r>
-        <w:rPr>
-          <w:rFonts w:ascii="Kalpurush" w:hAnsi="Kalpurush" w:cs="Kalpurush"/>
-          <w:cs/>
-          <w:lang w:bidi="bn-BD"/>
-        </w:rPr>
-        <w:t>টিমকে</w:t>
-      </w:r>
-      <w:proofErr w:type="spellEnd"/>
-      <w:r>
-        <w:rPr>
-          <w:rFonts w:ascii="Kalpurush" w:hAnsi="Kalpurush" w:cs="Kalpurush"/>
-          <w:cs/>
-          <w:lang w:bidi="bn-BD"/>
-        </w:rPr>
-        <w:t xml:space="preserve"> কিছু পরামর্শ দেওয়া। যেমন:</w:t>
+        <w:t>টিমকে কিছু পরামর্শ দেওয়া। যেমন:</w:t>
       </w:r>
     </w:p>
     <w:p>
@@ -742,39 +514,1308 @@
           <w:cs/>
           <w:lang w:bidi="bn-BD"/>
         </w:rPr>
-        <w:t xml:space="preserve">যদি আমরা ২০% বেতন বৃদ্ধি করি বা </w:t>
-      </w:r>
-      <w:proofErr w:type="spellStart"/>
+        <w:t>যদি আমরা ২০% বেতন বৃদ্ধি করি বা ওভারটাইম কমাই</w:t>
+      </w:r>
+      <w:r>
+        <w:rPr>
+          <w:rFonts w:ascii="Kalpurush" w:hAnsi="Kalpurush" w:cs="Kalpurush"/>
+        </w:rPr>
+        <w:t xml:space="preserve">, </w:t>
+      </w:r>
       <w:r>
         <w:rPr>
           <w:rFonts w:ascii="Kalpurush" w:hAnsi="Kalpurush" w:cs="Kalpurush"/>
           <w:cs/>
           <w:lang w:bidi="bn-BD"/>
         </w:rPr>
-        <w:t>ওভারটাইম</w:t>
-      </w:r>
-      <w:proofErr w:type="spellEnd"/>
-      <w:r>
-        <w:rPr>
-          <w:rFonts w:ascii="Kalpurush" w:hAnsi="Kalpurush" w:cs="Kalpurush"/>
+        <w:t>তবে ১০% কর্মীকে ধরে রাখা সম্ভব।"</w:t>
+      </w:r>
+    </w:p>
+    <w:p>
+      <w:pPr>
+        <w:rPr>
+          <w:rFonts w:ascii="Kalpurush" w:hAnsi="Kalpurush" w:cs="Kalpurush"/>
+          <w:lang w:bidi="bn-BD"/>
+        </w:rPr>
+      </w:pPr>
+    </w:p>
+    <w:p>
+      <w:pPr>
+        <w:rPr>
+          <w:rFonts w:ascii="Kalpurush" w:hAnsi="Kalpurush" w:cs="Kalpurush"/>
+          <w:lang w:bidi="bn-BD"/>
+        </w:rPr>
+      </w:pPr>
+    </w:p>
+    <w:p>
+      <w:pPr>
+        <w:rPr>
+          <w:rFonts w:ascii="Kalpurush" w:hAnsi="Kalpurush" w:cs="Kalpurush"/>
+          <w:lang w:bidi="bn-BD"/>
+        </w:rPr>
+      </w:pPr>
+      <w:r>
+        <w:rPr>
+          <w:rFonts w:ascii="Kalpurush" w:hAnsi="Kalpurush" w:cs="Kalpurush"/>
+          <w:lang w:bidi="bn-BD"/>
+        </w:rPr>
+        <w:lastRenderedPageBreak/>
+        <w:t>Department wise query</w:t>
+      </w:r>
+    </w:p>
+    <w:p>
+      <w:pPr>
+        <w:rPr>
+          <w:rFonts w:ascii="Kalpurush" w:hAnsi="Kalpurush" w:cs="Kalpurush"/>
+          <w:lang w:bidi="bn-BD"/>
+        </w:rPr>
+      </w:pPr>
+    </w:p>
+    <w:p>
+      <w:pPr>
+        <w:rPr>
+          <w:rFonts w:ascii="Kalpurush" w:hAnsi="Kalpurush" w:cs="Kalpurush"/>
+        </w:rPr>
+      </w:pPr>
+      <w:r>
+        <w:rPr>
+          <w:rFonts w:ascii="Kalpurush" w:hAnsi="Kalpurush" w:cs="Kalpurush"/>
+        </w:rPr>
+        <w:t xml:space="preserve">SELECT </w:t>
+      </w:r>
+    </w:p>
+    <w:p>
+      <w:pPr>
+        <w:rPr>
+          <w:rFonts w:ascii="Kalpurush" w:hAnsi="Kalpurush" w:cs="Kalpurush"/>
+        </w:rPr>
+      </w:pPr>
+      <w:r>
+        <w:rPr>
+          <w:rFonts w:ascii="Cambria" w:hAnsi="Cambria" w:cs="Cambria"/>
+        </w:rPr>
+        <w:t> </w:t>
+      </w:r>
+      <w:r>
+        <w:rPr>
+          <w:rFonts w:ascii="Kalpurush" w:hAnsi="Kalpurush" w:cs="Kalpurush"/>
+        </w:rPr>
+        <w:t xml:space="preserve"> </w:t>
+      </w:r>
+      <w:r>
+        <w:rPr>
+          <w:rFonts w:ascii="Cambria" w:hAnsi="Cambria" w:cs="Cambria"/>
+        </w:rPr>
+        <w:t> </w:t>
+      </w:r>
+      <w:r>
+        <w:rPr>
+          <w:rFonts w:ascii="Kalpurush" w:hAnsi="Kalpurush" w:cs="Kalpurush"/>
+        </w:rPr>
+        <w:t xml:space="preserve"> Department, </w:t>
+      </w:r>
+    </w:p>
+    <w:p>
+      <w:pPr>
+        <w:rPr>
+          <w:rFonts w:ascii="Kalpurush" w:hAnsi="Kalpurush" w:cs="Kalpurush"/>
+        </w:rPr>
+      </w:pPr>
+      <w:r>
+        <w:rPr>
+          <w:rFonts w:ascii="Cambria" w:hAnsi="Cambria" w:cs="Cambria"/>
+        </w:rPr>
+        <w:t> </w:t>
+      </w:r>
+      <w:r>
+        <w:rPr>
+          <w:rFonts w:ascii="Kalpurush" w:hAnsi="Kalpurush" w:cs="Kalpurush"/>
+        </w:rPr>
+        <w:t xml:space="preserve"> </w:t>
+      </w:r>
+      <w:r>
+        <w:rPr>
+          <w:rFonts w:ascii="Cambria" w:hAnsi="Cambria" w:cs="Cambria"/>
+        </w:rPr>
+        <w:t> </w:t>
+      </w:r>
+      <w:r>
+        <w:rPr>
+          <w:rFonts w:ascii="Kalpurush" w:hAnsi="Kalpurush" w:cs="Kalpurush"/>
+        </w:rPr>
+        <w:t xml:space="preserve"> Attrition,</w:t>
+      </w:r>
+    </w:p>
+    <w:p>
+      <w:pPr>
+        <w:rPr>
+          <w:rFonts w:ascii="Kalpurush" w:hAnsi="Kalpurush" w:cs="Kalpurush"/>
+        </w:rPr>
+      </w:pPr>
+      <w:r>
+        <w:rPr>
+          <w:rFonts w:ascii="Cambria" w:hAnsi="Cambria" w:cs="Cambria"/>
+        </w:rPr>
+        <w:t> </w:t>
+      </w:r>
+      <w:r>
+        <w:rPr>
+          <w:rFonts w:ascii="Kalpurush" w:hAnsi="Kalpurush" w:cs="Kalpurush"/>
+        </w:rPr>
+        <w:t xml:space="preserve"> </w:t>
+      </w:r>
+      <w:r>
+        <w:rPr>
+          <w:rFonts w:ascii="Cambria" w:hAnsi="Cambria" w:cs="Cambria"/>
+        </w:rPr>
+        <w:t> </w:t>
+      </w:r>
+      <w:r>
+        <w:rPr>
+          <w:rFonts w:ascii="Kalpurush" w:hAnsi="Kalpurush" w:cs="Kalpurush"/>
+        </w:rPr>
+        <w:t xml:space="preserve"> ROUND(AVG(MonthlyIncome), 2) AS Avg_Monthly_Income,</w:t>
+      </w:r>
+    </w:p>
+    <w:p>
+      <w:pPr>
+        <w:rPr>
+          <w:rFonts w:ascii="Kalpurush" w:hAnsi="Kalpurush" w:cs="Kalpurush"/>
+        </w:rPr>
+      </w:pPr>
+      <w:r>
+        <w:rPr>
+          <w:rFonts w:ascii="Cambria" w:hAnsi="Cambria" w:cs="Cambria"/>
+        </w:rPr>
+        <w:t> </w:t>
+      </w:r>
+      <w:r>
+        <w:rPr>
+          <w:rFonts w:ascii="Kalpurush" w:hAnsi="Kalpurush" w:cs="Kalpurush"/>
+        </w:rPr>
+        <w:t xml:space="preserve"> </w:t>
+      </w:r>
+      <w:r>
+        <w:rPr>
+          <w:rFonts w:ascii="Cambria" w:hAnsi="Cambria" w:cs="Cambria"/>
+        </w:rPr>
+        <w:t> </w:t>
+      </w:r>
+      <w:r>
+        <w:rPr>
+          <w:rFonts w:ascii="Kalpurush" w:hAnsi="Kalpurush" w:cs="Kalpurush"/>
+        </w:rPr>
+        <w:t xml:space="preserve"> COUNT(*) AS Employee_Count</w:t>
+      </w:r>
+    </w:p>
+    <w:p>
+      <w:pPr>
+        <w:rPr>
+          <w:rFonts w:ascii="Kalpurush" w:hAnsi="Kalpurush" w:cs="Kalpurush"/>
+        </w:rPr>
+      </w:pPr>
+      <w:r>
+        <w:rPr>
+          <w:rFonts w:ascii="Kalpurush" w:hAnsi="Kalpurush" w:cs="Kalpurush"/>
+        </w:rPr>
+        <w:t>FROM `mybigquerypractice-446408.hr_analytics.hr_employee`</w:t>
+      </w:r>
+    </w:p>
+    <w:p>
+      <w:pPr>
+        <w:rPr>
+          <w:rFonts w:ascii="Kalpurush" w:hAnsi="Kalpurush" w:cs="Kalpurush"/>
+        </w:rPr>
+      </w:pPr>
+      <w:r>
+        <w:rPr>
+          <w:rFonts w:ascii="Kalpurush" w:hAnsi="Kalpurush" w:cs="Kalpurush"/>
+        </w:rPr>
+        <w:t>GROUP BY Department, Attrition</w:t>
+      </w:r>
+    </w:p>
+    <w:p>
+      <w:pPr>
+        <w:rPr>
+          <w:rFonts w:ascii="Kalpurush" w:hAnsi="Kalpurush" w:cs="Kalpurush"/>
+        </w:rPr>
+      </w:pPr>
+      <w:r>
+        <w:rPr>
+          <w:rFonts w:ascii="Kalpurush" w:hAnsi="Kalpurush" w:cs="Kalpurush"/>
+        </w:rPr>
+        <w:t>ORDER BY Department, Attrition;</w:t>
+      </w:r>
+    </w:p>
+    <w:p>
+      <w:pPr>
+        <w:rPr>
+          <w:rFonts w:ascii="Kalpurush" w:hAnsi="Kalpurush" w:cs="Kalpurush"/>
+        </w:rPr>
+      </w:pPr>
+    </w:p>
+    <w:p>
+      <w:pPr>
+        <w:rPr>
+          <w:rFonts w:ascii="Kalpurush" w:hAnsi="Kalpurush" w:cs="Kalpurush"/>
+        </w:rPr>
+      </w:pPr>
+      <w:r>
+        <w:rPr>
+          <w:rFonts w:ascii="Cambria" w:hAnsi="Cambria" w:cs="Cambria"/>
+        </w:rPr>
+        <w:t> </w:t>
+      </w:r>
+      <w:r>
+        <w:rPr>
+          <w:rFonts w:ascii="Kalpurush" w:hAnsi="Kalpurush" w:cs="Kalpurush"/>
+        </w:rPr>
+        <w:t xml:space="preserve"> SELECT </w:t>
+      </w:r>
+    </w:p>
+    <w:p>
+      <w:pPr>
+        <w:rPr>
+          <w:rFonts w:ascii="Kalpurush" w:hAnsi="Kalpurush" w:cs="Kalpurush"/>
+        </w:rPr>
+      </w:pPr>
+      <w:r>
+        <w:rPr>
+          <w:rFonts w:ascii="Cambria" w:hAnsi="Cambria" w:cs="Cambria"/>
+        </w:rPr>
+        <w:t> </w:t>
+      </w:r>
+      <w:r>
+        <w:rPr>
+          <w:rFonts w:ascii="Kalpurush" w:hAnsi="Kalpurush" w:cs="Kalpurush"/>
+        </w:rPr>
+        <w:t xml:space="preserve"> </w:t>
+      </w:r>
+      <w:r>
+        <w:rPr>
+          <w:rFonts w:ascii="Cambria" w:hAnsi="Cambria" w:cs="Cambria"/>
+        </w:rPr>
+        <w:t> </w:t>
+      </w:r>
+      <w:r>
+        <w:rPr>
+          <w:rFonts w:ascii="Kalpurush" w:hAnsi="Kalpurush" w:cs="Kalpurush"/>
+        </w:rPr>
+        <w:t xml:space="preserve"> Department,</w:t>
+      </w:r>
+    </w:p>
+    <w:p>
+      <w:pPr>
+        <w:rPr>
+          <w:rFonts w:ascii="Kalpurush" w:hAnsi="Kalpurush" w:cs="Kalpurush"/>
+        </w:rPr>
+      </w:pPr>
+      <w:r>
+        <w:rPr>
+          <w:rFonts w:ascii="Cambria" w:hAnsi="Cambria" w:cs="Cambria"/>
+        </w:rPr>
+        <w:t> </w:t>
+      </w:r>
+      <w:r>
+        <w:rPr>
+          <w:rFonts w:ascii="Kalpurush" w:hAnsi="Kalpurush" w:cs="Kalpurush"/>
+        </w:rPr>
+        <w:t xml:space="preserve"> </w:t>
+      </w:r>
+      <w:r>
+        <w:rPr>
+          <w:rFonts w:ascii="Cambria" w:hAnsi="Cambria" w:cs="Cambria"/>
+        </w:rPr>
+        <w:t> </w:t>
+      </w:r>
+      <w:r>
+        <w:rPr>
+          <w:rFonts w:ascii="Kalpurush" w:hAnsi="Kalpurush" w:cs="Kalpurush"/>
+        </w:rPr>
+        <w:t xml:space="preserve"> COUNT(*) AS Total_Employees,</w:t>
+      </w:r>
+    </w:p>
+    <w:p>
+      <w:pPr>
+        <w:rPr>
+          <w:rFonts w:ascii="Kalpurush" w:hAnsi="Kalpurush" w:cs="Kalpurush"/>
+        </w:rPr>
+      </w:pPr>
+      <w:r>
+        <w:rPr>
+          <w:rFonts w:ascii="Cambria" w:hAnsi="Cambria" w:cs="Cambria"/>
+        </w:rPr>
+        <w:t> </w:t>
+      </w:r>
+      <w:r>
+        <w:rPr>
+          <w:rFonts w:ascii="Kalpurush" w:hAnsi="Kalpurush" w:cs="Kalpurush"/>
+        </w:rPr>
+        <w:t xml:space="preserve"> </w:t>
+      </w:r>
+      <w:r>
+        <w:rPr>
+          <w:rFonts w:ascii="Cambria" w:hAnsi="Cambria" w:cs="Cambria"/>
+        </w:rPr>
+        <w:t> </w:t>
+      </w:r>
+      <w:r>
+        <w:rPr>
+          <w:rFonts w:ascii="Kalpurush" w:hAnsi="Kalpurush" w:cs="Kalpurush"/>
+        </w:rPr>
+        <w:t xml:space="preserve"> SUM(CASE WHEN Attrition = TRUE THEN 1 ELSE 0 END) AS Left_count,</w:t>
+      </w:r>
+    </w:p>
+    <w:p>
+      <w:pPr>
+        <w:rPr>
+          <w:rFonts w:ascii="Kalpurush" w:hAnsi="Kalpurush" w:cs="Kalpurush"/>
+        </w:rPr>
+      </w:pPr>
+      <w:r>
+        <w:rPr>
+          <w:rFonts w:ascii="Cambria" w:hAnsi="Cambria" w:cs="Cambria"/>
+        </w:rPr>
+        <w:t> </w:t>
+      </w:r>
+      <w:r>
+        <w:rPr>
+          <w:rFonts w:ascii="Kalpurush" w:hAnsi="Kalpurush" w:cs="Kalpurush"/>
+        </w:rPr>
+        <w:t xml:space="preserve"> </w:t>
+      </w:r>
+      <w:r>
+        <w:rPr>
+          <w:rFonts w:ascii="Cambria" w:hAnsi="Cambria" w:cs="Cambria"/>
+        </w:rPr>
+        <w:t> </w:t>
+      </w:r>
+      <w:r>
+        <w:rPr>
+          <w:rFonts w:ascii="Kalpurush" w:hAnsi="Kalpurush" w:cs="Kalpurush"/>
+        </w:rPr>
+        <w:t xml:space="preserve"> ROUND(AVG(CASE WHEN Attrition = TRUE THEN 1 ELSE 0 END) * 100, 2) as Attrition_Rate</w:t>
+      </w:r>
+    </w:p>
+    <w:p>
+      <w:pPr>
+        <w:rPr>
+          <w:rFonts w:ascii="Kalpurush" w:hAnsi="Kalpurush" w:cs="Kalpurush"/>
+        </w:rPr>
+      </w:pPr>
+      <w:r>
+        <w:rPr>
+          <w:rFonts w:ascii="Cambria" w:hAnsi="Cambria" w:cs="Cambria"/>
+        </w:rPr>
+        <w:t> </w:t>
+      </w:r>
+      <w:r>
+        <w:rPr>
+          <w:rFonts w:ascii="Kalpurush" w:hAnsi="Kalpurush" w:cs="Kalpurush"/>
+        </w:rPr>
+        <w:t xml:space="preserve"> FROM `mybigquerypractice-446408.hr_analytics.hr_employee`</w:t>
+      </w:r>
+    </w:p>
+    <w:p>
+      <w:pPr>
+        <w:rPr>
+          <w:rFonts w:ascii="Kalpurush" w:hAnsi="Kalpurush" w:cs="Kalpurush"/>
+        </w:rPr>
+      </w:pPr>
+      <w:r>
+        <w:rPr>
+          <w:rFonts w:ascii="Cambria" w:hAnsi="Cambria" w:cs="Cambria"/>
+        </w:rPr>
+        <w:t> </w:t>
+      </w:r>
+      <w:r>
+        <w:rPr>
+          <w:rFonts w:ascii="Kalpurush" w:hAnsi="Kalpurush" w:cs="Kalpurush"/>
+        </w:rPr>
+        <w:t xml:space="preserve"> GROUP BY Department</w:t>
+      </w:r>
+    </w:p>
+    <w:p>
+      <w:pPr>
+        <w:rPr>
+          <w:rFonts w:ascii="Kalpurush" w:hAnsi="Kalpurush" w:cs="Kalpurush"/>
+        </w:rPr>
+      </w:pPr>
+      <w:r>
+        <w:rPr>
+          <w:rFonts w:ascii="Cambria" w:hAnsi="Cambria" w:cs="Cambria"/>
+        </w:rPr>
+        <w:t> </w:t>
+      </w:r>
+      <w:r>
+        <w:rPr>
+          <w:rFonts w:ascii="Kalpurush" w:hAnsi="Kalpurush" w:cs="Kalpurush"/>
+        </w:rPr>
+        <w:t xml:space="preserve"> ORDER BY Attrition_Rate DESC;</w:t>
+      </w:r>
+    </w:p>
+    <w:p>
+      <w:pPr>
+        <w:rPr>
+          <w:rFonts w:ascii="Kalpurush" w:hAnsi="Kalpurush" w:cs="Kalpurush"/>
+        </w:rPr>
+      </w:pPr>
+      <w:r>
+        <w:rPr>
+          <w:rFonts w:ascii="Kalpurush" w:hAnsi="Kalpurush" w:cs="Kalpurush"/>
+        </w:rPr>
+        <w:t xml:space="preserve">SELECT </w:t>
+      </w:r>
+    </w:p>
+    <w:p>
+      <w:pPr>
+        <w:rPr>
+          <w:rFonts w:ascii="Kalpurush" w:hAnsi="Kalpurush" w:cs="Kalpurush"/>
+        </w:rPr>
+      </w:pPr>
+      <w:r>
+        <w:rPr>
+          <w:rFonts w:ascii="Kalpurush" w:hAnsi="Kalpurush" w:cs="Kalpurush"/>
+        </w:rPr>
+        <w:t xml:space="preserve">    SUM(MonthlyIncome * 12 * 1.5) as Potential_Financial_Loss_Annual</w:t>
+      </w:r>
+    </w:p>
+    <w:p>
+      <w:pPr>
+        <w:rPr>
+          <w:rFonts w:ascii="Kalpurush" w:hAnsi="Kalpurush" w:cs="Kalpurush"/>
+        </w:rPr>
+      </w:pPr>
+      <w:r>
+        <w:rPr>
+          <w:rFonts w:ascii="Kalpurush" w:hAnsi="Kalpurush" w:cs="Kalpurush"/>
+        </w:rPr>
+        <w:lastRenderedPageBreak/>
+        <w:t>FROM `</w:t>
+      </w:r>
+      <w:r>
+        <w:rPr>
+          <w:rFonts w:ascii="Kalpurush" w:hAnsi="Kalpurush" w:cs="Kalpurush"/>
+          <w:cs/>
+          <w:lang w:bidi="bn-IN"/>
+        </w:rPr>
+        <w:t>আপনার</w:t>
+      </w:r>
+      <w:r>
+        <w:rPr>
+          <w:rFonts w:ascii="Kalpurush" w:hAnsi="Kalpurush" w:cs="Kalpurush"/>
+        </w:rPr>
+        <w:t>_</w:t>
+      </w:r>
+      <w:r>
+        <w:rPr>
+          <w:rFonts w:ascii="Kalpurush" w:hAnsi="Kalpurush" w:cs="Kalpurush"/>
+          <w:cs/>
+          <w:lang w:bidi="bn-IN"/>
+        </w:rPr>
+        <w:t>প্রজেক্ট.ডাটাসেট.টেবিল</w:t>
+      </w:r>
+      <w:r>
+        <w:rPr>
+          <w:rFonts w:ascii="Kalpurush" w:hAnsi="Kalpurush" w:cs="Kalpurush"/>
+        </w:rPr>
+        <w:t>`</w:t>
+      </w:r>
+    </w:p>
+    <w:p>
+      <w:pPr>
+        <w:rPr>
+          <w:rFonts w:ascii="Kalpurush" w:hAnsi="Kalpurush" w:cs="Kalpurush"/>
+        </w:rPr>
+      </w:pPr>
+      <w:r>
+        <w:rPr>
+          <w:rFonts w:ascii="Kalpurush" w:hAnsi="Kalpurush" w:cs="Kalpurush"/>
+        </w:rPr>
+        <w:t>WHERE Attrition = 'Yes';</w:t>
+      </w:r>
+    </w:p>
+    <w:p>
+      <w:pPr>
+        <w:rPr>
+          <w:rFonts w:ascii="Kalpurush" w:hAnsi="Kalpurush" w:cs="Kalpurush"/>
+        </w:rPr>
+      </w:pPr>
+    </w:p>
+    <w:p>
+      <w:pPr>
+        <w:rPr>
+          <w:rFonts w:ascii="Kalpurush" w:hAnsi="Kalpurush" w:cs="Kalpurush"/>
+        </w:rPr>
+      </w:pPr>
+    </w:p>
+    <w:p>
+      <w:pPr>
+        <w:rPr>
+          <w:rFonts w:ascii="Kalpurush" w:hAnsi="Kalpurush" w:cs="Kalpurush"/>
+          <w:b/>
+          <w:bCs/>
+        </w:rPr>
+      </w:pPr>
+      <w:r>
+        <w:rPr>
+          <w:rFonts w:ascii="Kalpurush" w:hAnsi="Kalpurush" w:cs="Kalpurush"/>
+          <w:b/>
+          <w:bCs/>
           <w:cs/>
           <w:lang w:bidi="bn-BD"/>
         </w:rPr>
-        <w:t xml:space="preserve"> কমাই</w:t>
-      </w:r>
-      <w:r>
-        <w:rPr>
-          <w:rFonts w:ascii="Kalpurush" w:hAnsi="Kalpurush" w:cs="Kalpurush"/>
-        </w:rPr>
-        <w:t xml:space="preserve">, </w:t>
-      </w:r>
+        <w:t>ক্যারিয়ারের স্থবিরতা (</w:t>
+      </w:r>
+      <w:r>
+        <w:rPr>
+          <w:rFonts w:ascii="Kalpurush" w:hAnsi="Kalpurush" w:cs="Kalpurush"/>
+          <w:b/>
+          <w:bCs/>
+        </w:rPr>
+        <w:t>Career Stagnation)</w:t>
+      </w:r>
+    </w:p>
+    <w:p>
+      <w:pPr>
+        <w:rPr>
+          <w:rFonts w:ascii="Kalpurush" w:hAnsi="Kalpurush" w:cs="Kalpurush"/>
+        </w:rPr>
+      </w:pPr>
       <w:r>
         <w:rPr>
           <w:rFonts w:ascii="Kalpurush" w:hAnsi="Kalpurush" w:cs="Kalpurush"/>
           <w:cs/>
           <w:lang w:bidi="bn-BD"/>
         </w:rPr>
-        <w:t>তবে ১০% কর্মীকে ধরে রাখা সম্ভব।"</w:t>
+        <w:t>অনেক সময় দেখা যায় মানুষ একই পদে অনেক বছর আটকে থাকলে চাকরি ছেড়ে দেয়। আমরা দেখবো যারা চলে গেছে তারা কত বছর ধরে একই রোলে ছিল</w:t>
+      </w:r>
+      <w:r>
+        <w:rPr>
+          <w:rFonts w:ascii="Kalpurush" w:hAnsi="Kalpurush" w:cs="Kalpurush"/>
+          <w:cs/>
+          <w:lang w:bidi="hi-IN"/>
+        </w:rPr>
+        <w:t>।</w:t>
+      </w:r>
+    </w:p>
+    <w:p>
+      <w:pPr>
+        <w:rPr>
+          <w:rFonts w:ascii="Kalpurush" w:hAnsi="Kalpurush" w:cs="Kalpurush"/>
+        </w:rPr>
+      </w:pPr>
+      <w:r>
+        <w:rPr>
+          <w:rFonts w:ascii="Cambria" w:hAnsi="Cambria" w:cs="Cambria"/>
+        </w:rPr>
+        <w:t> </w:t>
+      </w:r>
+      <w:r>
+        <w:rPr>
+          <w:rFonts w:ascii="Kalpurush" w:hAnsi="Kalpurush" w:cs="Kalpurush"/>
+        </w:rPr>
+        <w:t xml:space="preserve"> SELECT</w:t>
+      </w:r>
+    </w:p>
+    <w:p>
+      <w:pPr>
+        <w:rPr>
+          <w:rFonts w:ascii="Kalpurush" w:hAnsi="Kalpurush" w:cs="Kalpurush"/>
+        </w:rPr>
+      </w:pPr>
+      <w:r>
+        <w:rPr>
+          <w:rFonts w:ascii="Cambria" w:hAnsi="Cambria" w:cs="Cambria"/>
+        </w:rPr>
+        <w:t> </w:t>
+      </w:r>
+      <w:r>
+        <w:rPr>
+          <w:rFonts w:ascii="Kalpurush" w:hAnsi="Kalpurush" w:cs="Kalpurush"/>
+        </w:rPr>
+        <w:t xml:space="preserve"> </w:t>
+      </w:r>
+      <w:r>
+        <w:rPr>
+          <w:rFonts w:ascii="Cambria" w:hAnsi="Cambria" w:cs="Cambria"/>
+        </w:rPr>
+        <w:t> </w:t>
+      </w:r>
+      <w:r>
+        <w:rPr>
+          <w:rFonts w:ascii="Kalpurush" w:hAnsi="Kalpurush" w:cs="Kalpurush"/>
+        </w:rPr>
+        <w:t>YearsInCurrentRole,</w:t>
+      </w:r>
+    </w:p>
+    <w:p>
+      <w:pPr>
+        <w:rPr>
+          <w:rFonts w:ascii="Kalpurush" w:hAnsi="Kalpurush" w:cs="Kalpurush"/>
+        </w:rPr>
+      </w:pPr>
+      <w:r>
+        <w:rPr>
+          <w:rFonts w:ascii="Cambria" w:hAnsi="Cambria" w:cs="Cambria"/>
+        </w:rPr>
+        <w:t> </w:t>
+      </w:r>
+      <w:r>
+        <w:rPr>
+          <w:rFonts w:ascii="Kalpurush" w:hAnsi="Kalpurush" w:cs="Kalpurush"/>
+        </w:rPr>
+        <w:t xml:space="preserve"> </w:t>
+      </w:r>
+      <w:r>
+        <w:rPr>
+          <w:rFonts w:ascii="Cambria" w:hAnsi="Cambria" w:cs="Cambria"/>
+        </w:rPr>
+        <w:t> </w:t>
+      </w:r>
+      <w:r>
+        <w:rPr>
+          <w:rFonts w:ascii="Kalpurush" w:hAnsi="Kalpurush" w:cs="Kalpurush"/>
+        </w:rPr>
+        <w:t>COUNT(*) AS Total_Employee,</w:t>
+      </w:r>
+    </w:p>
+    <w:p>
+      <w:pPr>
+        <w:rPr>
+          <w:rFonts w:ascii="Kalpurush" w:hAnsi="Kalpurush" w:cs="Kalpurush"/>
+        </w:rPr>
+      </w:pPr>
+      <w:r>
+        <w:rPr>
+          <w:rFonts w:ascii="Cambria" w:hAnsi="Cambria" w:cs="Cambria"/>
+        </w:rPr>
+        <w:t> </w:t>
+      </w:r>
+      <w:r>
+        <w:rPr>
+          <w:rFonts w:ascii="Kalpurush" w:hAnsi="Kalpurush" w:cs="Kalpurush"/>
+        </w:rPr>
+        <w:t xml:space="preserve"> </w:t>
+      </w:r>
+      <w:r>
+        <w:rPr>
+          <w:rFonts w:ascii="Cambria" w:hAnsi="Cambria" w:cs="Cambria"/>
+        </w:rPr>
+        <w:t> </w:t>
+      </w:r>
+      <w:r>
+        <w:rPr>
+          <w:rFonts w:ascii="Kalpurush" w:hAnsi="Kalpurush" w:cs="Kalpurush"/>
+        </w:rPr>
+        <w:t>SUM(CASE WHEN Attrition = True THEN 1 ELSE 0 END) AS Left_Count,</w:t>
+      </w:r>
+    </w:p>
+    <w:p>
+      <w:pPr>
+        <w:rPr>
+          <w:rFonts w:ascii="Kalpurush" w:hAnsi="Kalpurush" w:cs="Kalpurush"/>
+        </w:rPr>
+      </w:pPr>
+      <w:r>
+        <w:rPr>
+          <w:rFonts w:ascii="Cambria" w:hAnsi="Cambria" w:cs="Cambria"/>
+        </w:rPr>
+        <w:t> </w:t>
+      </w:r>
+      <w:r>
+        <w:rPr>
+          <w:rFonts w:ascii="Kalpurush" w:hAnsi="Kalpurush" w:cs="Kalpurush"/>
+        </w:rPr>
+        <w:t xml:space="preserve"> </w:t>
+      </w:r>
+      <w:r>
+        <w:rPr>
+          <w:rFonts w:ascii="Cambria" w:hAnsi="Cambria" w:cs="Cambria"/>
+        </w:rPr>
+        <w:t> </w:t>
+      </w:r>
+      <w:r>
+        <w:rPr>
+          <w:rFonts w:ascii="Kalpurush" w:hAnsi="Kalpurush" w:cs="Kalpurush"/>
+        </w:rPr>
+        <w:t>ROUND(AVG(CASE WHEN Attrition=TRUE THEN 1 ELSE 0 END) * 100,2) AS Attrition_Rate</w:t>
+      </w:r>
+    </w:p>
+    <w:p>
+      <w:pPr>
+        <w:rPr>
+          <w:rFonts w:ascii="Kalpurush" w:hAnsi="Kalpurush" w:cs="Kalpurush"/>
+        </w:rPr>
+      </w:pPr>
+      <w:r>
+        <w:rPr>
+          <w:rFonts w:ascii="Cambria" w:hAnsi="Cambria" w:cs="Cambria"/>
+        </w:rPr>
+        <w:t> </w:t>
+      </w:r>
+      <w:r>
+        <w:rPr>
+          <w:rFonts w:ascii="Kalpurush" w:hAnsi="Kalpurush" w:cs="Kalpurush"/>
+        </w:rPr>
+        <w:t xml:space="preserve"> FROM `mybigquerypractice-446408.hr_analytics.hr_employee` </w:t>
+      </w:r>
+    </w:p>
+    <w:p>
+      <w:pPr>
+        <w:rPr>
+          <w:rFonts w:ascii="Kalpurush" w:hAnsi="Kalpurush" w:cs="Kalpurush"/>
+        </w:rPr>
+      </w:pPr>
+      <w:r>
+        <w:rPr>
+          <w:rFonts w:ascii="Cambria" w:hAnsi="Cambria" w:cs="Cambria"/>
+        </w:rPr>
+        <w:t> </w:t>
+      </w:r>
+      <w:r>
+        <w:rPr>
+          <w:rFonts w:ascii="Kalpurush" w:hAnsi="Kalpurush" w:cs="Kalpurush"/>
+        </w:rPr>
+        <w:t xml:space="preserve"> group by YearsInCurrentRole</w:t>
+      </w:r>
+    </w:p>
+    <w:p>
+      <w:pPr>
+        <w:rPr>
+          <w:rFonts w:ascii="Kalpurush" w:hAnsi="Kalpurush" w:cs="Kalpurush"/>
+        </w:rPr>
+      </w:pPr>
+      <w:r>
+        <w:rPr>
+          <w:rFonts w:ascii="Cambria" w:hAnsi="Cambria" w:cs="Cambria"/>
+        </w:rPr>
+        <w:t> </w:t>
+      </w:r>
+      <w:r>
+        <w:rPr>
+          <w:rFonts w:ascii="Kalpurush" w:hAnsi="Kalpurush" w:cs="Kalpurush"/>
+        </w:rPr>
+        <w:t xml:space="preserve"> ORDER BY YearsInCurrentRole;</w:t>
+      </w:r>
+    </w:p>
+    <w:p>
+      <w:pPr>
+        <w:rPr>
+          <w:rFonts w:ascii="Kalpurush" w:hAnsi="Kalpurush" w:cs="Kalpurush"/>
+        </w:rPr>
+      </w:pPr>
+    </w:p>
+    <w:p>
+      <w:pPr>
+        <w:rPr>
+          <w:rFonts w:ascii="Kalpurush" w:hAnsi="Kalpurush" w:cs="Kalpurush"/>
+        </w:rPr>
+      </w:pPr>
+    </w:p>
+    <w:p>
+      <w:pPr>
+        <w:rPr>
+          <w:rFonts w:ascii="Kalpurush" w:hAnsi="Kalpurush" w:cs="Kalpurush"/>
+        </w:rPr>
+      </w:pPr>
+    </w:p>
+    <w:p>
+      <w:pPr>
+        <w:rPr>
+          <w:rFonts w:ascii="Kalpurush" w:hAnsi="Kalpurush" w:cs="Kalpurush"/>
+        </w:rPr>
+      </w:pPr>
+    </w:p>
+    <w:p>
+      <w:pPr>
+        <w:rPr>
+          <w:rFonts w:ascii="Kalpurush" w:hAnsi="Kalpurush" w:cs="Kalpurush"/>
+        </w:rPr>
+      </w:pPr>
+    </w:p>
+    <w:p>
+      <w:pPr>
+        <w:rPr>
+          <w:rFonts w:ascii="Kalpurush" w:hAnsi="Kalpurush" w:cs="Kalpurush"/>
+        </w:rPr>
+      </w:pPr>
+    </w:p>
+    <w:p>
+      <w:pPr>
+        <w:rPr>
+          <w:rFonts w:ascii="Kalpurush" w:hAnsi="Kalpurush" w:cs="Kalpurush"/>
+        </w:rPr>
+      </w:pPr>
+    </w:p>
+    <w:p>
+      <w:pPr>
+        <w:rPr>
+          <w:rFonts w:ascii="Kalpurush" w:hAnsi="Kalpurush" w:cs="Kalpurush"/>
+          <w:b/>
+          <w:bCs/>
+        </w:rPr>
+      </w:pPr>
+      <w:r>
+        <w:rPr>
+          <w:rFonts w:ascii="Kalpurush" w:hAnsi="Kalpurush" w:cs="Kalpurush"/>
+          <w:b/>
+          <w:bCs/>
+        </w:rPr>
+        <w:lastRenderedPageBreak/>
+        <w:t>Gemini said</w:t>
+      </w:r>
+    </w:p>
+    <w:p>
+      <w:pPr>
+        <w:rPr>
+          <w:rFonts w:ascii="Kalpurush" w:hAnsi="Kalpurush" w:cs="Kalpurush"/>
+        </w:rPr>
+      </w:pPr>
+      <w:r>
+        <w:rPr>
+          <w:rFonts w:ascii="Kalpurush" w:hAnsi="Kalpurush" w:cs="Kalpurush"/>
+          <w:cs/>
+          <w:lang w:bidi="bn-BD"/>
+        </w:rPr>
+        <w:t>কাগলে (</w:t>
+      </w:r>
+      <w:r>
+        <w:rPr>
+          <w:rFonts w:ascii="Kalpurush" w:hAnsi="Kalpurush" w:cs="Kalpurush"/>
+        </w:rPr>
+        <w:t xml:space="preserve">Kaggle) </w:t>
+      </w:r>
+      <w:r>
+        <w:rPr>
+          <w:rFonts w:ascii="Kalpurush" w:hAnsi="Kalpurush" w:cs="Kalpurush"/>
+          <w:cs/>
+          <w:lang w:bidi="bn-BD"/>
+        </w:rPr>
+        <w:t>বা আপনার লিংকডইন (</w:t>
+      </w:r>
+      <w:r>
+        <w:rPr>
+          <w:rFonts w:ascii="Kalpurush" w:hAnsi="Kalpurush" w:cs="Kalpurush"/>
+        </w:rPr>
+        <w:t xml:space="preserve">LinkedIn) </w:t>
+      </w:r>
+      <w:r>
+        <w:rPr>
+          <w:rFonts w:ascii="Kalpurush" w:hAnsi="Kalpurush" w:cs="Kalpurush"/>
+          <w:cs/>
+          <w:lang w:bidi="bn-BD"/>
+        </w:rPr>
+        <w:t>প্রোফাইলের জন্য একটি প্রফেশনাল</w:t>
+      </w:r>
+      <w:r>
+        <w:rPr>
+          <w:rFonts w:ascii="Kalpurush" w:hAnsi="Kalpurush" w:cs="Kalpurush"/>
+        </w:rPr>
+        <w:t xml:space="preserve"> </w:t>
+      </w:r>
+      <w:r>
+        <w:rPr>
+          <w:rFonts w:ascii="Kalpurush" w:hAnsi="Kalpurush" w:cs="Kalpurush"/>
+          <w:b/>
+          <w:bCs/>
+        </w:rPr>
+        <w:t>Executive Summary</w:t>
+      </w:r>
+      <w:r>
+        <w:rPr>
+          <w:rFonts w:ascii="Kalpurush" w:hAnsi="Kalpurush" w:cs="Kalpurush"/>
+        </w:rPr>
+        <w:t xml:space="preserve"> </w:t>
+      </w:r>
+      <w:r>
+        <w:rPr>
+          <w:rFonts w:ascii="Kalpurush" w:hAnsi="Kalpurush" w:cs="Kalpurush"/>
+          <w:cs/>
+          <w:lang w:bidi="bn-BD"/>
+        </w:rPr>
+        <w:t>নিচে দেওয়া হলো:</w:t>
+      </w:r>
+    </w:p>
+    <w:p>
+      <w:pPr>
+        <w:rPr>
+          <w:rFonts w:ascii="Kalpurush" w:hAnsi="Kalpurush" w:cs="Kalpurush"/>
+        </w:rPr>
+      </w:pPr>
+      <w:r>
+        <w:rPr>
+          <w:rFonts w:ascii="Kalpurush" w:hAnsi="Kalpurush" w:cs="Kalpurush"/>
+        </w:rPr>
+        <w:pict w14:anchorId="3B4D43AA">
+          <v:rect id="_x0000_i1031" style="width:0;height:1.5pt" o:hralign="center" o:hrstd="t" o:hr="t" fillcolor="#a0a0a0" stroked="f"/>
+        </w:pict>
+      </w:r>
+    </w:p>
+    <w:p>
+      <w:pPr>
+        <w:rPr>
+          <w:rFonts w:ascii="Kalpurush" w:hAnsi="Kalpurush" w:cs="Kalpurush"/>
+          <w:b/>
+          <w:bCs/>
+        </w:rPr>
+      </w:pPr>
+      <w:r>
+        <w:rPr>
+          <w:rFonts w:ascii="Kalpurush" w:hAnsi="Kalpurush" w:cs="Kalpurush"/>
+          <w:b/>
+          <w:bCs/>
+        </w:rPr>
+        <w:t>Executive Summary: HR Data Analytics - Uncovering Employee Attrition Trends</w:t>
+      </w:r>
+    </w:p>
+    <w:p>
+      <w:pPr>
+        <w:rPr>
+          <w:rFonts w:ascii="Kalpurush" w:hAnsi="Kalpurush" w:cs="Kalpurush"/>
+          <w:b/>
+          <w:bCs/>
+        </w:rPr>
+      </w:pPr>
+      <w:r>
+        <w:rPr>
+          <w:rFonts w:ascii="Kalpurush" w:hAnsi="Kalpurush" w:cs="Kalpurush"/>
+          <w:b/>
+          <w:bCs/>
+        </w:rPr>
+        <w:t>Overview</w:t>
+      </w:r>
+    </w:p>
+    <w:p>
+      <w:pPr>
+        <w:rPr>
+          <w:rFonts w:ascii="Kalpurush" w:hAnsi="Kalpurush" w:cs="Kalpurush"/>
+        </w:rPr>
+      </w:pPr>
+      <w:r>
+        <w:rPr>
+          <w:rFonts w:ascii="Kalpurush" w:hAnsi="Kalpurush" w:cs="Kalpurush"/>
+        </w:rPr>
+        <w:t xml:space="preserve">This project analyzes the IBM HR Analytics dataset to identify the core drivers of employee attrition. By leveraging </w:t>
+      </w:r>
+      <w:r>
+        <w:rPr>
+          <w:rFonts w:ascii="Kalpurush" w:hAnsi="Kalpurush" w:cs="Kalpurush"/>
+          <w:b/>
+          <w:bCs/>
+        </w:rPr>
+        <w:t>Google BigQuery</w:t>
+      </w:r>
+      <w:r>
+        <w:rPr>
+          <w:rFonts w:ascii="Kalpurush" w:hAnsi="Kalpurush" w:cs="Kalpurush"/>
+        </w:rPr>
+        <w:t xml:space="preserve"> for data processing and visualization, the study provides data-driven insights into why talent leaves and the subsequent financial impact on the organization.</w:t>
+      </w:r>
+    </w:p>
+    <w:p>
+      <w:pPr>
+        <w:rPr>
+          <w:rFonts w:ascii="Kalpurush" w:hAnsi="Kalpurush" w:cs="Kalpurush"/>
+          <w:b/>
+          <w:bCs/>
+        </w:rPr>
+      </w:pPr>
+      <w:r>
+        <w:rPr>
+          <w:rFonts w:ascii="Kalpurush" w:hAnsi="Kalpurush" w:cs="Kalpurush"/>
+          <w:b/>
+          <w:bCs/>
+        </w:rPr>
+        <w:t>Key Findings</w:t>
+      </w:r>
+    </w:p>
+    <w:p>
+      <w:pPr>
+        <w:numPr>
+          <w:ilvl w:val="0"/>
+          <w:numId w:val="5"/>
+        </w:numPr>
+        <w:rPr>
+          <w:rFonts w:ascii="Kalpurush" w:hAnsi="Kalpurush" w:cs="Kalpurush"/>
+        </w:rPr>
+      </w:pPr>
+      <w:r>
+        <w:rPr>
+          <w:rFonts w:ascii="Kalpurush" w:hAnsi="Kalpurush" w:cs="Kalpurush"/>
+          <w:b/>
+          <w:bCs/>
+        </w:rPr>
+        <w:t>The Overtime Trigger</w:t>
+      </w:r>
+      <w:r>
+        <w:rPr>
+          <w:rFonts w:ascii="Kalpurush" w:hAnsi="Kalpurush" w:cs="Kalpurush"/>
+        </w:rPr>
+        <w:t xml:space="preserve">: A significant </w:t>
+      </w:r>
+      <w:r>
+        <w:rPr>
+          <w:rFonts w:ascii="Kalpurush" w:hAnsi="Kalpurush" w:cs="Kalpurush"/>
+          <w:b/>
+          <w:bCs/>
+        </w:rPr>
+        <w:t>53.58%</w:t>
+      </w:r>
+      <w:r>
+        <w:rPr>
+          <w:rFonts w:ascii="Kalpurush" w:hAnsi="Kalpurush" w:cs="Kalpurush"/>
+        </w:rPr>
+        <w:t xml:space="preserve"> of employees who left the company were regularly working overtime, indicating a strong correlation between work pressure and attrition.</w:t>
+      </w:r>
+    </w:p>
+    <w:p>
+      <w:pPr>
+        <w:numPr>
+          <w:ilvl w:val="0"/>
+          <w:numId w:val="5"/>
+        </w:numPr>
+        <w:rPr>
+          <w:rFonts w:ascii="Kalpurush" w:hAnsi="Kalpurush" w:cs="Kalpurush"/>
+        </w:rPr>
+      </w:pPr>
+      <w:r>
+        <w:rPr>
+          <w:rFonts w:ascii="Kalpurush" w:hAnsi="Kalpurush" w:cs="Kalpurush"/>
+          <w:b/>
+          <w:bCs/>
+        </w:rPr>
+        <w:t>Salary Disparity</w:t>
+      </w:r>
+      <w:r>
+        <w:rPr>
+          <w:rFonts w:ascii="Kalpurush" w:hAnsi="Kalpurush" w:cs="Kalpurush"/>
+        </w:rPr>
+        <w:t>: Across all departments, there is a visible "Salary Gap." Those who left had significantly lower average monthly incomes compared to those who stayed.</w:t>
+      </w:r>
+    </w:p>
+    <w:p>
+      <w:pPr>
+        <w:numPr>
+          <w:ilvl w:val="0"/>
+          <w:numId w:val="5"/>
+        </w:numPr>
+        <w:rPr>
+          <w:rFonts w:ascii="Kalpurush" w:hAnsi="Kalpurush" w:cs="Kalpurush"/>
+        </w:rPr>
+      </w:pPr>
+      <w:r>
+        <w:rPr>
+          <w:rFonts w:ascii="Kalpurush" w:hAnsi="Kalpurush" w:cs="Kalpurush"/>
+          <w:b/>
+          <w:bCs/>
+        </w:rPr>
+        <w:t>High-Risk Demographic</w:t>
+      </w:r>
+      <w:r>
+        <w:rPr>
+          <w:rFonts w:ascii="Kalpurush" w:hAnsi="Kalpurush" w:cs="Kalpurush"/>
+        </w:rPr>
+        <w:t xml:space="preserve">: While the </w:t>
+      </w:r>
+      <w:r>
+        <w:rPr>
+          <w:rFonts w:ascii="Kalpurush" w:hAnsi="Kalpurush" w:cs="Kalpurush"/>
+          <w:b/>
+          <w:bCs/>
+        </w:rPr>
+        <w:t>30-45 age group</w:t>
+      </w:r>
+      <w:r>
+        <w:rPr>
+          <w:rFonts w:ascii="Kalpurush" w:hAnsi="Kalpurush" w:cs="Kalpurush"/>
+        </w:rPr>
+        <w:t xml:space="preserve"> saw the highest number of exits (112 employees), the </w:t>
+      </w:r>
+      <w:r>
+        <w:rPr>
+          <w:rFonts w:ascii="Kalpurush" w:hAnsi="Kalpurush" w:cs="Kalpurush"/>
+          <w:b/>
+          <w:bCs/>
+        </w:rPr>
+        <w:t>Under 30</w:t>
+      </w:r>
+      <w:r>
+        <w:rPr>
+          <w:rFonts w:ascii="Kalpurush" w:hAnsi="Kalpurush" w:cs="Kalpurush"/>
+        </w:rPr>
+        <w:t xml:space="preserve"> group faced the highest attrition rate (</w:t>
+      </w:r>
+      <w:r>
+        <w:rPr>
+          <w:rFonts w:ascii="Kalpurush" w:hAnsi="Kalpurush" w:cs="Kalpurush"/>
+          <w:b/>
+          <w:bCs/>
+        </w:rPr>
+        <w:t>28%</w:t>
+      </w:r>
+      <w:r>
+        <w:rPr>
+          <w:rFonts w:ascii="Kalpurush" w:hAnsi="Kalpurush" w:cs="Kalpurush"/>
+        </w:rPr>
+        <w:t>), primarily due to lower entry-level pay.</w:t>
+      </w:r>
+    </w:p>
+    <w:p>
+      <w:pPr>
+        <w:numPr>
+          <w:ilvl w:val="0"/>
+          <w:numId w:val="5"/>
+        </w:numPr>
+        <w:rPr>
+          <w:rFonts w:ascii="Kalpurush" w:hAnsi="Kalpurush" w:cs="Kalpurush"/>
+        </w:rPr>
+      </w:pPr>
+      <w:r>
+        <w:rPr>
+          <w:rFonts w:ascii="Kalpurush" w:hAnsi="Kalpurush" w:cs="Kalpurush"/>
+          <w:b/>
+          <w:bCs/>
+        </w:rPr>
+        <w:t>Career Stagnation</w:t>
+      </w:r>
+      <w:r>
+        <w:rPr>
+          <w:rFonts w:ascii="Kalpurush" w:hAnsi="Kalpurush" w:cs="Kalpurush"/>
+        </w:rPr>
+        <w:t>: Attrition peaks during the first year of employment and again at mid-career intervals (7-8 and 14-15 years), suggesting a lack of clear promotion paths or new challenges.</w:t>
+      </w:r>
+    </w:p>
+    <w:p>
+      <w:pPr>
+        <w:numPr>
+          <w:ilvl w:val="0"/>
+          <w:numId w:val="5"/>
+        </w:numPr>
+        <w:rPr>
+          <w:rFonts w:ascii="Kalpurush" w:hAnsi="Kalpurush" w:cs="Kalpurush"/>
+        </w:rPr>
+      </w:pPr>
+      <w:r>
+        <w:rPr>
+          <w:rFonts w:ascii="Kalpurush" w:hAnsi="Kalpurush" w:cs="Kalpurush"/>
+          <w:b/>
+          <w:bCs/>
+        </w:rPr>
+        <w:lastRenderedPageBreak/>
+        <w:t>Financial Impact</w:t>
+      </w:r>
+      <w:r>
+        <w:rPr>
+          <w:rFonts w:ascii="Kalpurush" w:hAnsi="Kalpurush" w:cs="Kalpurush"/>
+        </w:rPr>
+        <w:t xml:space="preserve">: Based on the industry-standard 1.5x turnover cost, the loss of 237 employees has resulted in an estimated financial drain of over </w:t>
+      </w:r>
+      <w:r>
+        <w:rPr>
+          <w:rFonts w:ascii="Kalpurush" w:hAnsi="Kalpurush" w:cs="Kalpurush"/>
+          <w:b/>
+          <w:bCs/>
+        </w:rPr>
+        <w:t>$20 million</w:t>
+      </w:r>
+      <w:r>
+        <w:rPr>
+          <w:rFonts w:ascii="Kalpurush" w:hAnsi="Kalpurush" w:cs="Kalpurush"/>
+        </w:rPr>
+        <w:t xml:space="preserve"> for the company.</w:t>
+      </w:r>
+    </w:p>
+    <w:p>
+      <w:pPr>
+        <w:rPr>
+          <w:rFonts w:ascii="Kalpurush" w:hAnsi="Kalpurush" w:cs="Kalpurush"/>
+          <w:b/>
+          <w:bCs/>
+        </w:rPr>
+      </w:pPr>
+      <w:r>
+        <w:rPr>
+          <w:rFonts w:ascii="Kalpurush" w:hAnsi="Kalpurush" w:cs="Kalpurush"/>
+          <w:b/>
+          <w:bCs/>
+        </w:rPr>
+        <w:t>Strategic Recommendations</w:t>
+      </w:r>
+    </w:p>
+    <w:p>
+      <w:pPr>
+        <w:numPr>
+          <w:ilvl w:val="0"/>
+          <w:numId w:val="6"/>
+        </w:numPr>
+        <w:rPr>
+          <w:rFonts w:ascii="Kalpurush" w:hAnsi="Kalpurush" w:cs="Kalpurush"/>
+        </w:rPr>
+      </w:pPr>
+      <w:r>
+        <w:rPr>
+          <w:rFonts w:ascii="Kalpurush" w:hAnsi="Kalpurush" w:cs="Kalpurush"/>
+          <w:b/>
+          <w:bCs/>
+        </w:rPr>
+        <w:t>Revise Compensation</w:t>
+      </w:r>
+      <w:r>
+        <w:rPr>
+          <w:rFonts w:ascii="Kalpurush" w:hAnsi="Kalpurush" w:cs="Kalpurush"/>
+        </w:rPr>
+        <w:t>: Re-evaluate the pay scale for entry-level and HR roles to ensure market competitiveness.</w:t>
+      </w:r>
+    </w:p>
+    <w:p>
+      <w:pPr>
+        <w:numPr>
+          <w:ilvl w:val="0"/>
+          <w:numId w:val="6"/>
+        </w:numPr>
+        <w:rPr>
+          <w:rFonts w:ascii="Kalpurush" w:hAnsi="Kalpurush" w:cs="Kalpurush"/>
+        </w:rPr>
+      </w:pPr>
+      <w:r>
+        <w:rPr>
+          <w:rFonts w:ascii="Kalpurush" w:hAnsi="Kalpurush" w:cs="Kalpurush"/>
+          <w:b/>
+          <w:bCs/>
+        </w:rPr>
+        <w:t>Work-Life Balance</w:t>
+      </w:r>
+      <w:r>
+        <w:rPr>
+          <w:rFonts w:ascii="Kalpurush" w:hAnsi="Kalpurush" w:cs="Kalpurush"/>
+        </w:rPr>
+        <w:t>: Implement stricter overtime policies or increase departmental headcount to reduce burnout.</w:t>
+      </w:r>
+    </w:p>
+    <w:p>
+      <w:pPr>
+        <w:numPr>
+          <w:ilvl w:val="0"/>
+          <w:numId w:val="6"/>
+        </w:numPr>
+        <w:rPr>
+          <w:rFonts w:ascii="Kalpurush" w:hAnsi="Kalpurush" w:cs="Kalpurush"/>
+        </w:rPr>
+      </w:pPr>
+      <w:r>
+        <w:rPr>
+          <w:rFonts w:ascii="Kalpurush" w:hAnsi="Kalpurush" w:cs="Kalpurush"/>
+          <w:b/>
+          <w:bCs/>
+        </w:rPr>
+        <w:t>Retention Programs</w:t>
+      </w:r>
+      <w:r>
+        <w:rPr>
+          <w:rFonts w:ascii="Kalpurush" w:hAnsi="Kalpurush" w:cs="Kalpurush"/>
+        </w:rPr>
+        <w:t>: Focus on career development and mentorship during the critical first year and mid-career milestones.</w:t>
       </w:r>
     </w:p>
     <w:p>
@@ -1095,6 +2136,304 @@
     </w:lvl>
   </w:abstractNum>
   <w:abstractNum w:abstractNumId="2" w15:restartNumberingAfterBreak="0">
+    <w:nsid w:val="546C099E"/>
+    <w:multiLevelType w:val="multilevel"/>
+    <w:tmpl w:val="518E1050"/>
+    <w:lvl w:ilvl="0">
+      <w:start w:val="1"/>
+      <w:numFmt w:val="bullet"/>
+      <w:lvlText w:val=""/>
+      <w:lvlJc w:val="left"/>
+      <w:pPr>
+        <w:tabs>
+          <w:tab w:val="num" w:pos="720"/>
+        </w:tabs>
+        <w:ind w:left="720" w:hanging="360"/>
+      </w:pPr>
+      <w:rPr>
+        <w:rFonts w:ascii="Symbol" w:hAnsi="Symbol" w:hint="default"/>
+        <w:sz w:val="20"/>
+      </w:rPr>
+    </w:lvl>
+    <w:lvl w:ilvl="1" w:tentative="1">
+      <w:start w:val="1"/>
+      <w:numFmt w:val="bullet"/>
+      <w:lvlText w:val=""/>
+      <w:lvlJc w:val="left"/>
+      <w:pPr>
+        <w:tabs>
+          <w:tab w:val="num" w:pos="1440"/>
+        </w:tabs>
+        <w:ind w:left="1440" w:hanging="360"/>
+      </w:pPr>
+      <w:rPr>
+        <w:rFonts w:ascii="Symbol" w:hAnsi="Symbol" w:hint="default"/>
+        <w:sz w:val="20"/>
+      </w:rPr>
+    </w:lvl>
+    <w:lvl w:ilvl="2" w:tentative="1">
+      <w:start w:val="1"/>
+      <w:numFmt w:val="bullet"/>
+      <w:lvlText w:val=""/>
+      <w:lvlJc w:val="left"/>
+      <w:pPr>
+        <w:tabs>
+          <w:tab w:val="num" w:pos="2160"/>
+        </w:tabs>
+        <w:ind w:left="2160" w:hanging="360"/>
+      </w:pPr>
+      <w:rPr>
+        <w:rFonts w:ascii="Symbol" w:hAnsi="Symbol" w:hint="default"/>
+        <w:sz w:val="20"/>
+      </w:rPr>
+    </w:lvl>
+    <w:lvl w:ilvl="3" w:tentative="1">
+      <w:start w:val="1"/>
+      <w:numFmt w:val="bullet"/>
+      <w:lvlText w:val=""/>
+      <w:lvlJc w:val="left"/>
+      <w:pPr>
+        <w:tabs>
+          <w:tab w:val="num" w:pos="2880"/>
+        </w:tabs>
+        <w:ind w:left="2880" w:hanging="360"/>
+      </w:pPr>
+      <w:rPr>
+        <w:rFonts w:ascii="Symbol" w:hAnsi="Symbol" w:hint="default"/>
+        <w:sz w:val="20"/>
+      </w:rPr>
+    </w:lvl>
+    <w:lvl w:ilvl="4" w:tentative="1">
+      <w:start w:val="1"/>
+      <w:numFmt w:val="bullet"/>
+      <w:lvlText w:val=""/>
+      <w:lvlJc w:val="left"/>
+      <w:pPr>
+        <w:tabs>
+          <w:tab w:val="num" w:pos="3600"/>
+        </w:tabs>
+        <w:ind w:left="3600" w:hanging="360"/>
+      </w:pPr>
+      <w:rPr>
+        <w:rFonts w:ascii="Symbol" w:hAnsi="Symbol" w:hint="default"/>
+        <w:sz w:val="20"/>
+      </w:rPr>
+    </w:lvl>
+    <w:lvl w:ilvl="5" w:tentative="1">
+      <w:start w:val="1"/>
+      <w:numFmt w:val="bullet"/>
+      <w:lvlText w:val=""/>
+      <w:lvlJc w:val="left"/>
+      <w:pPr>
+        <w:tabs>
+          <w:tab w:val="num" w:pos="4320"/>
+        </w:tabs>
+        <w:ind w:left="4320" w:hanging="360"/>
+      </w:pPr>
+      <w:rPr>
+        <w:rFonts w:ascii="Symbol" w:hAnsi="Symbol" w:hint="default"/>
+        <w:sz w:val="20"/>
+      </w:rPr>
+    </w:lvl>
+    <w:lvl w:ilvl="6" w:tentative="1">
+      <w:start w:val="1"/>
+      <w:numFmt w:val="bullet"/>
+      <w:lvlText w:val=""/>
+      <w:lvlJc w:val="left"/>
+      <w:pPr>
+        <w:tabs>
+          <w:tab w:val="num" w:pos="5040"/>
+        </w:tabs>
+        <w:ind w:left="5040" w:hanging="360"/>
+      </w:pPr>
+      <w:rPr>
+        <w:rFonts w:ascii="Symbol" w:hAnsi="Symbol" w:hint="default"/>
+        <w:sz w:val="20"/>
+      </w:rPr>
+    </w:lvl>
+    <w:lvl w:ilvl="7" w:tentative="1">
+      <w:start w:val="1"/>
+      <w:numFmt w:val="bullet"/>
+      <w:lvlText w:val=""/>
+      <w:lvlJc w:val="left"/>
+      <w:pPr>
+        <w:tabs>
+          <w:tab w:val="num" w:pos="5760"/>
+        </w:tabs>
+        <w:ind w:left="5760" w:hanging="360"/>
+      </w:pPr>
+      <w:rPr>
+        <w:rFonts w:ascii="Symbol" w:hAnsi="Symbol" w:hint="default"/>
+        <w:sz w:val="20"/>
+      </w:rPr>
+    </w:lvl>
+    <w:lvl w:ilvl="8" w:tentative="1">
+      <w:start w:val="1"/>
+      <w:numFmt w:val="bullet"/>
+      <w:lvlText w:val=""/>
+      <w:lvlJc w:val="left"/>
+      <w:pPr>
+        <w:tabs>
+          <w:tab w:val="num" w:pos="6480"/>
+        </w:tabs>
+        <w:ind w:left="6480" w:hanging="360"/>
+      </w:pPr>
+      <w:rPr>
+        <w:rFonts w:ascii="Symbol" w:hAnsi="Symbol" w:hint="default"/>
+        <w:sz w:val="20"/>
+      </w:rPr>
+    </w:lvl>
+  </w:abstractNum>
+  <w:abstractNum w:abstractNumId="3" w15:restartNumberingAfterBreak="0">
+    <w:nsid w:val="62E23CAB"/>
+    <w:multiLevelType w:val="multilevel"/>
+    <w:tmpl w:val="6032E260"/>
+    <w:lvl w:ilvl="0">
+      <w:start w:val="1"/>
+      <w:numFmt w:val="bullet"/>
+      <w:lvlText w:val=""/>
+      <w:lvlJc w:val="left"/>
+      <w:pPr>
+        <w:tabs>
+          <w:tab w:val="num" w:pos="720"/>
+        </w:tabs>
+        <w:ind w:left="720" w:hanging="360"/>
+      </w:pPr>
+      <w:rPr>
+        <w:rFonts w:ascii="Symbol" w:hAnsi="Symbol" w:hint="default"/>
+        <w:sz w:val="20"/>
+      </w:rPr>
+    </w:lvl>
+    <w:lvl w:ilvl="1" w:tentative="1">
+      <w:start w:val="1"/>
+      <w:numFmt w:val="bullet"/>
+      <w:lvlText w:val=""/>
+      <w:lvlJc w:val="left"/>
+      <w:pPr>
+        <w:tabs>
+          <w:tab w:val="num" w:pos="1440"/>
+        </w:tabs>
+        <w:ind w:left="1440" w:hanging="360"/>
+      </w:pPr>
+      <w:rPr>
+        <w:rFonts w:ascii="Symbol" w:hAnsi="Symbol" w:hint="default"/>
+        <w:sz w:val="20"/>
+      </w:rPr>
+    </w:lvl>
+    <w:lvl w:ilvl="2" w:tentative="1">
+      <w:start w:val="1"/>
+      <w:numFmt w:val="bullet"/>
+      <w:lvlText w:val=""/>
+      <w:lvlJc w:val="left"/>
+      <w:pPr>
+        <w:tabs>
+          <w:tab w:val="num" w:pos="2160"/>
+        </w:tabs>
+        <w:ind w:left="2160" w:hanging="360"/>
+      </w:pPr>
+      <w:rPr>
+        <w:rFonts w:ascii="Symbol" w:hAnsi="Symbol" w:hint="default"/>
+        <w:sz w:val="20"/>
+      </w:rPr>
+    </w:lvl>
+    <w:lvl w:ilvl="3" w:tentative="1">
+      <w:start w:val="1"/>
+      <w:numFmt w:val="bullet"/>
+      <w:lvlText w:val=""/>
+      <w:lvlJc w:val="left"/>
+      <w:pPr>
+        <w:tabs>
+          <w:tab w:val="num" w:pos="2880"/>
+        </w:tabs>
+        <w:ind w:left="2880" w:hanging="360"/>
+      </w:pPr>
+      <w:rPr>
+        <w:rFonts w:ascii="Symbol" w:hAnsi="Symbol" w:hint="default"/>
+        <w:sz w:val="20"/>
+      </w:rPr>
+    </w:lvl>
+    <w:lvl w:ilvl="4" w:tentative="1">
+      <w:start w:val="1"/>
+      <w:numFmt w:val="bullet"/>
+      <w:lvlText w:val=""/>
+      <w:lvlJc w:val="left"/>
+      <w:pPr>
+        <w:tabs>
+          <w:tab w:val="num" w:pos="3600"/>
+        </w:tabs>
+        <w:ind w:left="3600" w:hanging="360"/>
+      </w:pPr>
+      <w:rPr>
+        <w:rFonts w:ascii="Symbol" w:hAnsi="Symbol" w:hint="default"/>
+        <w:sz w:val="20"/>
+      </w:rPr>
+    </w:lvl>
+    <w:lvl w:ilvl="5" w:tentative="1">
+      <w:start w:val="1"/>
+      <w:numFmt w:val="bullet"/>
+      <w:lvlText w:val=""/>
+      <w:lvlJc w:val="left"/>
+      <w:pPr>
+        <w:tabs>
+          <w:tab w:val="num" w:pos="4320"/>
+        </w:tabs>
+        <w:ind w:left="4320" w:hanging="360"/>
+      </w:pPr>
+      <w:rPr>
+        <w:rFonts w:ascii="Symbol" w:hAnsi="Symbol" w:hint="default"/>
+        <w:sz w:val="20"/>
+      </w:rPr>
+    </w:lvl>
+    <w:lvl w:ilvl="6" w:tentative="1">
+      <w:start w:val="1"/>
+      <w:numFmt w:val="bullet"/>
+      <w:lvlText w:val=""/>
+      <w:lvlJc w:val="left"/>
+      <w:pPr>
+        <w:tabs>
+          <w:tab w:val="num" w:pos="5040"/>
+        </w:tabs>
+        <w:ind w:left="5040" w:hanging="360"/>
+      </w:pPr>
+      <w:rPr>
+        <w:rFonts w:ascii="Symbol" w:hAnsi="Symbol" w:hint="default"/>
+        <w:sz w:val="20"/>
+      </w:rPr>
+    </w:lvl>
+    <w:lvl w:ilvl="7" w:tentative="1">
+      <w:start w:val="1"/>
+      <w:numFmt w:val="bullet"/>
+      <w:lvlText w:val=""/>
+      <w:lvlJc w:val="left"/>
+      <w:pPr>
+        <w:tabs>
+          <w:tab w:val="num" w:pos="5760"/>
+        </w:tabs>
+        <w:ind w:left="5760" w:hanging="360"/>
+      </w:pPr>
+      <w:rPr>
+        <w:rFonts w:ascii="Symbol" w:hAnsi="Symbol" w:hint="default"/>
+        <w:sz w:val="20"/>
+      </w:rPr>
+    </w:lvl>
+    <w:lvl w:ilvl="8" w:tentative="1">
+      <w:start w:val="1"/>
+      <w:numFmt w:val="bullet"/>
+      <w:lvlText w:val=""/>
+      <w:lvlJc w:val="left"/>
+      <w:pPr>
+        <w:tabs>
+          <w:tab w:val="num" w:pos="6480"/>
+        </w:tabs>
+        <w:ind w:left="6480" w:hanging="360"/>
+      </w:pPr>
+      <w:rPr>
+        <w:rFonts w:ascii="Symbol" w:hAnsi="Symbol" w:hint="default"/>
+        <w:sz w:val="20"/>
+      </w:rPr>
+    </w:lvl>
+  </w:abstractNum>
+  <w:abstractNum w:abstractNumId="4" w15:restartNumberingAfterBreak="0">
     <w:nsid w:val="64A60996"/>
     <w:multiLevelType w:val="multilevel"/>
     <w:tmpl w:val="F510FDAE"/>
@@ -1243,7 +2582,7 @@
       </w:rPr>
     </w:lvl>
   </w:abstractNum>
-  <w:abstractNum w:abstractNumId="3" w15:restartNumberingAfterBreak="0">
+  <w:abstractNum w:abstractNumId="5" w15:restartNumberingAfterBreak="0">
     <w:nsid w:val="6A452F82"/>
     <w:multiLevelType w:val="multilevel"/>
     <w:tmpl w:val="B33443E6"/>
@@ -1396,12 +2735,18 @@
     <w:abstractNumId w:val="1"/>
   </w:num>
   <w:num w:numId="2" w16cid:durableId="346105144">
-    <w:abstractNumId w:val="3"/>
+    <w:abstractNumId w:val="5"/>
   </w:num>
   <w:num w:numId="3" w16cid:durableId="817066107">
     <w:abstractNumId w:val="0"/>
   </w:num>
   <w:num w:numId="4" w16cid:durableId="1313562610">
+    <w:abstractNumId w:val="4"/>
+  </w:num>
+  <w:num w:numId="5" w16cid:durableId="546185449">
+    <w:abstractNumId w:val="3"/>
+  </w:num>
+  <w:num w:numId="6" w16cid:durableId="398669667">
     <w:abstractNumId w:val="2"/>
   </w:num>
 </w:numbering>

</xml_diff>